<commit_message>
Add title page to IR project report
Co-Authored-By: Claude Opus 5.5 <noreply@anthropic.com>
</commit_message>
<xml_diff>
--- a/IR_Report_Amazon_ESCI.docx
+++ b/IR_Report_Amazon_ESCI.docx
@@ -2,6 +2,290 @@
 <file path=word/document.xml><?xml version="1.0" encoding="utf-8"?>
 <w:document xmlns:wpc="http://schemas.microsoft.com/office/word/2010/wordprocessingCanvas" xmlns:cx="http://schemas.microsoft.com/office/drawing/2014/chartex" xmlns:cx1="http://schemas.microsoft.com/office/drawing/2015/9/8/chartex" xmlns:cx2="http://schemas.microsoft.com/office/drawing/2015/10/21/chartex" xmlns:cx3="http://schemas.microsoft.com/office/drawing/2016/5/9/chartex" xmlns:cx4="http://schemas.microsoft.com/office/drawing/2016/5/10/chartex" xmlns:cx5="http://schemas.microsoft.com/office/drawing/2016/5/11/chartex" xmlns:cx6="http://schemas.microsoft.com/office/drawing/2016/5/12/chartex" xmlns:cx7="http://schemas.microsoft.com/office/drawing/2016/5/13/chartex" xmlns:cx8="http://schemas.microsoft.com/office/drawing/2016/5/14/chartex" xmlns:mc="http://schemas.openxmlformats.org/markup-compatibility/2006" xmlns:aink="http://schemas.microsoft.com/office/drawing/2016/ink" xmlns:am3d="http://schemas.microsoft.com/office/drawing/2017/model3d" xmlns:o="urn:schemas-microsoft-com:office:office" xmlns:oel="http://schemas.microsoft.com/office/2019/extlst" xmlns:r="http://schemas.openxmlformats.org/officeDocument/2006/relationships" xmlns:m="http://schemas.openxmlformats.org/officeDocument/2006/math" xmlns:v="urn:schemas-microsoft-com:vml" xmlns:wp14="http://schemas.microsoft.com/office/word/2010/wordprocessingDrawing" xmlns:wp="http://schemas.openxmlformats.org/drawingml/2006/wordprocessingDrawing" xmlns:w10="urn:schemas-microsoft-com:office:word" xmlns:w="http://schemas.openxmlformats.org/wordprocessingml/2006/main" xmlns:w14="http://schemas.microsoft.com/office/word/2010/wordml" xmlns:w15="http://schemas.microsoft.com/office/word/2012/wordml" xmlns:w16cei="http://schemas.microsoft.com/office/word/2026/wordml/cei" xmlns:w16cex="http://schemas.microsoft.com/office/word/2018/wordml/cex" xmlns:w16cid="http://schemas.microsoft.com/office/word/2016/wordml/cid" xmlns:w16="http://schemas.microsoft.com/office/word/2018/wordml" xmlns:w16du="http://schemas.microsoft.com/office/word/2023/wordml/word16du" xmlns:w16sdtdh="http://schemas.microsoft.com/office/word/2020/wordml/sdtdatahash" xmlns:w16sdtfl="http://schemas.microsoft.com/office/word/2024/wordml/sdtformatlock" xmlns:w16se="http://schemas.microsoft.com/office/word/2015/wordml/symex" xmlns:wpg="http://schemas.microsoft.com/office/word/2010/wordprocessingGroup" xmlns:wpi="http://schemas.microsoft.com/office/word/2010/wordprocessingInk" xmlns:wne="http://schemas.microsoft.com/office/word/2006/wordml" xmlns:wps="http://schemas.microsoft.com/office/word/2010/wordprocessingShape" mc:Ignorable="w14 w15 w16se w16cid w16 w16cex w16sdtdh w16sdtfl w16du wp14">
   <w:body>
+    <w:p>
+      <w:pPr>
+        <w:spacing w:before="360" w:after="360" w:line="276" w:lineRule="auto"/>
+        <w:jc w:val="center"/>
+      </w:pPr>
+      <w:r>
+        <w:rPr>
+          <w:rFonts w:ascii="Times New Roman" w:hAnsi="Times New Roman" w:cs="Times New Roman"/>
+          <w:b/>
+          <w:bCs/>
+          <w:sz w:val="48"/>
+          <w:szCs w:val="48"/>
+        </w:rPr>
+        <w:t xml:space="preserve">INFORMATION RETRIEVAL PROJECT REPORT</w:t>
+      </w:r>
+    </w:p>
+    <w:p>
+      <w:pPr>
+        <w:spacing w:before="0" w:after="600" w:line="276" w:lineRule="auto"/>
+        <w:jc w:val="center"/>
+      </w:pPr>
+      <w:r>
+        <w:rPr>
+          <w:rFonts w:ascii="Times New Roman" w:hAnsi="Times New Roman" w:cs="Times New Roman"/>
+          <w:b/>
+          <w:bCs/>
+          <w:sz w:val="32"/>
+          <w:szCs w:val="32"/>
+        </w:rPr>
+        <w:t xml:space="preserve">Comparative Performance Evaluation of Lexical, Neural and Hybrid Ranking for E-Commerce Product Search on the Amazon ESCI Dataset</w:t>
+      </w:r>
+    </w:p>
+    <w:p>
+      <w:pPr>
+        <w:spacing w:before="0" w:after="240" w:line="276" w:lineRule="auto"/>
+        <w:jc w:val="center"/>
+      </w:pPr>
+      <w:r>
+        <w:rPr>
+          <w:rFonts w:ascii="Times New Roman" w:hAnsi="Times New Roman" w:cs="Times New Roman"/>
+          <w:sz w:val="24"/>
+          <w:szCs w:val="24"/>
+        </w:rPr>
+        <w:t xml:space="preserve">Submitted in partial fulfilment of the</w:t>
+      </w:r>
+      <w:r>
+        <w:rPr>
+          <w:rFonts w:ascii="Times New Roman" w:hAnsi="Times New Roman" w:cs="Times New Roman"/>
+          <w:sz w:val="24"/>
+          <w:szCs w:val="24"/>
+        </w:rPr>
+        <w:br/>
+        <w:t xml:space="preserve">requirement for the award of the degree of</w:t>
+      </w:r>
+    </w:p>
+    <w:p>
+      <w:pPr>
+        <w:spacing w:before="0" w:after="120" w:line="276" w:lineRule="auto"/>
+        <w:jc w:val="center"/>
+      </w:pPr>
+      <w:r>
+        <w:rPr>
+          <w:rFonts w:ascii="Times New Roman" w:hAnsi="Times New Roman" w:cs="Times New Roman"/>
+          <w:b/>
+          <w:bCs/>
+          <w:sz w:val="28"/>
+          <w:szCs w:val="28"/>
+        </w:rPr>
+        <w:t xml:space="preserve">BACHELOR OF TECHNOLOGY (B. Tech)</w:t>
+      </w:r>
+    </w:p>
+    <w:p>
+      <w:pPr>
+        <w:spacing w:before="0" w:after="120" w:line="276" w:lineRule="auto"/>
+        <w:jc w:val="center"/>
+      </w:pPr>
+      <w:r>
+        <w:rPr>
+          <w:rFonts w:ascii="Times New Roman" w:hAnsi="Times New Roman" w:cs="Times New Roman"/>
+          <w:sz w:val="24"/>
+          <w:szCs w:val="24"/>
+        </w:rPr>
+        <w:t xml:space="preserve">in</w:t>
+      </w:r>
+    </w:p>
+    <w:p>
+      <w:pPr>
+        <w:spacing w:before="0" w:after="480" w:line="276" w:lineRule="auto"/>
+        <w:jc w:val="center"/>
+      </w:pPr>
+      <w:r>
+        <w:rPr>
+          <w:rFonts w:ascii="Times New Roman" w:hAnsi="Times New Roman" w:cs="Times New Roman"/>
+          <w:b/>
+          <w:bCs/>
+          <w:sz w:val="28"/>
+          <w:szCs w:val="28"/>
+        </w:rPr>
+        <w:t xml:space="preserve">Computer Science and Engineering</w:t>
+      </w:r>
+    </w:p>
+    <w:p>
+      <w:pPr>
+        <w:spacing w:before="0" w:after="120" w:line="276" w:lineRule="auto"/>
+        <w:jc w:val="center"/>
+      </w:pPr>
+      <w:r>
+        <w:rPr>
+          <w:rFonts w:ascii="Times New Roman" w:hAnsi="Times New Roman" w:cs="Times New Roman"/>
+          <w:b/>
+          <w:bCs/>
+          <w:sz w:val="24"/>
+          <w:szCs w:val="24"/>
+        </w:rPr>
+        <w:t xml:space="preserve">Submitted by</w:t>
+      </w:r>
+    </w:p>
+    <w:p>
+      <w:pPr>
+        <w:spacing w:before="0" w:after="480" w:line="276" w:lineRule="auto"/>
+        <w:jc w:val="center"/>
+      </w:pPr>
+      <w:r>
+        <w:rPr>
+          <w:rFonts w:ascii="Times New Roman" w:hAnsi="Times New Roman" w:cs="Times New Roman"/>
+          <w:sz w:val="24"/>
+          <w:szCs w:val="24"/>
+        </w:rPr>
+        <w:t xml:space="preserve">RASAGYA VATSAL (23FE10CSE00716)</w:t>
+      </w:r>
+      <w:r>
+        <w:rPr>
+          <w:rFonts w:ascii="Times New Roman" w:hAnsi="Times New Roman" w:cs="Times New Roman"/>
+          <w:sz w:val="24"/>
+          <w:szCs w:val="24"/>
+        </w:rPr>
+        <w:br/>
+        <w:t xml:space="preserve">KESHAV AGRAWAL (23FE10CSE00810)</w:t>
+      </w:r>
+      <w:r>
+        <w:rPr>
+          <w:rFonts w:ascii="Times New Roman" w:hAnsi="Times New Roman" w:cs="Times New Roman"/>
+          <w:sz w:val="24"/>
+          <w:szCs w:val="24"/>
+        </w:rPr>
+        <w:br/>
+        <w:t xml:space="preserve">SHIVANSH DHYANI (23FE10CSE00722)</w:t>
+      </w:r>
+    </w:p>
+    <w:p>
+      <w:pPr>
+        <w:spacing w:before="0" w:after="240" w:line="276" w:lineRule="auto"/>
+        <w:jc w:val="center"/>
+      </w:pPr>
+      <w:r>
+        <w:rPr>
+          <w:rFonts w:ascii="Times New Roman" w:hAnsi="Times New Roman" w:cs="Times New Roman"/>
+          <w:b/>
+          <w:bCs/>
+          <w:sz w:val="24"/>
+          <w:szCs w:val="24"/>
+        </w:rPr>
+        <w:t xml:space="preserve">Submitted to</w:t>
+      </w:r>
+    </w:p>
+    <w:p>
+      <w:pPr>
+        <w:spacing w:before="0" w:after="120"/>
+        <w:jc w:val="center"/>
+      </w:pPr>
+      <w:r>
+        <w:rPr>
+          <w:noProof/>
+        </w:rPr>
+        <w:drawing>
+          <wp:inline distT="0" distB="0" distL="0" distR="0">
+            <wp:extent cx="4169663" cy="822960"/>
+            <wp:effectExtent l="0" t="0" r="0" b="0"/>
+            <wp:docPr id="900" name="MUJ Logo" descr="Manipal University Jaipur logo"/>
+            <wp:cNvGraphicFramePr>
+              <a:graphicFrameLocks xmlns:a="http://schemas.openxmlformats.org/drawingml/2006/main" noChangeAspect="1"/>
+            </wp:cNvGraphicFramePr>
+            <a:graphic xmlns:a="http://schemas.openxmlformats.org/drawingml/2006/main">
+              <a:graphicData uri="http://schemas.openxmlformats.org/drawingml/2006/picture">
+                <pic:pic xmlns:pic="http://schemas.openxmlformats.org/drawingml/2006/picture">
+                  <pic:nvPicPr>
+                    <pic:cNvPr id="900" name="muj_logo.jpeg"/>
+                    <pic:cNvPicPr/>
+                  </pic:nvPicPr>
+                  <pic:blipFill>
+                    <a:blip r:embed="rIdMujLogo"/>
+                    <a:stretch>
+                      <a:fillRect/>
+                    </a:stretch>
+                  </pic:blipFill>
+                  <pic:spPr>
+                    <a:xfrm>
+                      <a:off x="0" y="0"/>
+                      <a:ext cx="4169663" cy="822960"/>
+                    </a:xfrm>
+                    <a:prstGeom prst="rect">
+                      <a:avLst/>
+                    </a:prstGeom>
+                  </pic:spPr>
+                </pic:pic>
+              </a:graphicData>
+            </a:graphic>
+          </wp:inline>
+        </w:drawing>
+      </w:r>
+    </w:p>
+    <w:p>
+      <w:pPr>
+        <w:spacing w:before="0" w:after="240" w:line="276" w:lineRule="auto"/>
+        <w:jc w:val="center"/>
+      </w:pPr>
+      <w:r>
+        <w:rPr>
+          <w:rFonts w:ascii="Times New Roman" w:hAnsi="Times New Roman" w:cs="Times New Roman"/>
+          <w:b/>
+          <w:bCs/>
+          <w:sz w:val="24"/>
+          <w:szCs w:val="24"/>
+        </w:rPr>
+        <w:t xml:space="preserve">DEPARTMENT OF COMPUTER SCIENCE AND ENGINEERING,</w:t>
+      </w:r>
+      <w:r>
+        <w:rPr>
+          <w:rFonts w:ascii="Times New Roman" w:hAnsi="Times New Roman" w:cs="Times New Roman"/>
+          <w:b/>
+          <w:bCs/>
+          <w:sz w:val="24"/>
+          <w:szCs w:val="24"/>
+        </w:rPr>
+        <w:br/>
+        <w:t xml:space="preserve">SCHOOL OF COMPUTER SCIENCE &amp; ENGINEERING,</w:t>
+      </w:r>
+      <w:r>
+        <w:rPr>
+          <w:rFonts w:ascii="Times New Roman" w:hAnsi="Times New Roman" w:cs="Times New Roman"/>
+          <w:b/>
+          <w:bCs/>
+          <w:sz w:val="24"/>
+          <w:szCs w:val="24"/>
+        </w:rPr>
+        <w:br/>
+        <w:t xml:space="preserve">MANIPAL UNIVERSITY JAIPUR,</w:t>
+      </w:r>
+      <w:r>
+        <w:rPr>
+          <w:rFonts w:ascii="Times New Roman" w:hAnsi="Times New Roman" w:cs="Times New Roman"/>
+          <w:b/>
+          <w:bCs/>
+          <w:sz w:val="24"/>
+          <w:szCs w:val="24"/>
+        </w:rPr>
+        <w:br/>
+        <w:t xml:space="preserve">RAJASTHAN, INDIA-303007</w:t>
+      </w:r>
+    </w:p>
+    <w:p>
+      <w:pPr>
+        <w:spacing w:before="0" w:after="0" w:line="276" w:lineRule="auto"/>
+        <w:jc w:val="center"/>
+      </w:pPr>
+      <w:r>
+        <w:rPr>
+          <w:rFonts w:ascii="Times New Roman" w:hAnsi="Times New Roman" w:cs="Times New Roman"/>
+          <w:b/>
+          <w:bCs/>
+          <w:sz w:val="24"/>
+          <w:szCs w:val="24"/>
+        </w:rPr>
+        <w:t xml:space="preserve">OCTOBER 2026</w:t>
+      </w:r>
+    </w:p>
+    <w:p>
+      <w:pPr>
+        <w:spacing w:before="0" w:after="0"/>
+      </w:pPr>
+      <w:r>
+        <w:br w:type="page"/>
+      </w:r>
+    </w:p>
     <w:p>
       <w:pPr>
         <w:spacing w:after="240"/>

</xml_diff>